<commit_message>
docs: add Vercel deployment link and complete screenshot evidence figures
</commit_message>
<xml_diff>
--- a/Lab_1_Report.docx
+++ b/Lab_1_Report.docx
@@ -18,16 +18,20 @@
     </w:p>
     <w:p>
       <w:pPr>
-        <w:spacing w:after="240"/>
+        <w:spacing w:after="200"/>
       </w:pPr>
       <w:r>
         <w:rPr>
           <w:color w:val="4B5563"/>
-          <w:sz w:val="20"/>
+          <w:sz w:val="19"/>
         </w:rPr>
         <w:t>Application: OpsPulse — Cloud Native DevOps Telemetry &amp; Deployment Portal</w:t>
         <w:br/>
-        <w:t>MCA Trimester 5 | Repository: https://github.com/Achindra2003/devops-lab1-opspulse</w:t>
+        <w:t>MCA Trimester 5 — DevOps Lab | Student: Achindra Sharma (2547105) — 4MCA A</w:t>
+        <w:br/>
+        <w:t>Live Vercel URL: https://opspulse-devops-lab1.vercel.app</w:t>
+        <w:br/>
+        <w:t>GitHub: https://github.com/Achindra2003/devops-lab1-opspulse</w:t>
       </w:r>
     </w:p>
     <w:tbl>
@@ -132,7 +136,7 @@
     </w:tbl>
     <w:p>
       <w:pPr>
-        <w:spacing w:after="200"/>
+        <w:spacing w:after="160"/>
       </w:pPr>
     </w:p>
     <w:p>
@@ -147,12 +151,66 @@
           <w:color w:val="1F2937"/>
           <w:sz w:val="26"/>
         </w:rPr>
-        <w:t>1. Project Description</w:t>
+        <w:t>1. Project Description &amp; Live Vercel Deployment</w:t>
       </w:r>
     </w:p>
     <w:p>
       <w:r>
-        <w:t>I built OpsPulse as a practical DevOps telemetry and deployment dashboard rather than a placeholder student site. The application runs entirely on static HTML5, CSS3, and modern Vanilla JavaScript without compilation steps or third-party node packages. It models what an infrastructure engineer monitors during an on-call shift: tracking microservice latencies (Kong Gateway, Auth &amp; IAM, PostgreSQL Primary, Worker Queue, Redis Cache), simulating traffic bursts, offering multi-environment views (Production, Staging, Development), and displaying an interactive deployment pipeline.</w:t>
+        <w:t>I built OpsPulse as a practical DevOps telemetry and deployment dashboard rather than a placeholder student site. The application runs entirely on static HTML5, CSS3, and modern Vanilla JavaScript without compilation steps or third-party node packages. It is deployed live to production on Vercel at https://opspulse-devops-lab1.vercel.app with continuous deployment connected to my GitHub repository. It models what an infrastructure engineer monitors during an on-call shift: tracking microservice latencies (Kong Gateway, Auth &amp; IAM, PostgreSQL Primary, Worker Queue, Redis Cache), simulating traffic bursts, offering multi-environment views (Production, Staging, Development), and displaying an interactive deployment pipeline.</w:t>
+      </w:r>
+    </w:p>
+    <w:p>
+      <w:pPr>
+        <w:spacing w:before="120" w:after="40"/>
+        <w:jc w:val="center"/>
+      </w:pPr>
+      <w:r>
+        <w:drawing>
+          <wp:inline xmlns:a="http://schemas.openxmlformats.org/drawingml/2006/main" xmlns:pic="http://schemas.openxmlformats.org/drawingml/2006/picture">
+            <wp:extent cx="5669280" cy="3401568"/>
+            <wp:docPr id="1" name="Picture 1"/>
+            <wp:cNvGraphicFramePr>
+              <a:graphicFrameLocks noChangeAspect="1"/>
+            </wp:cNvGraphicFramePr>
+            <a:graphic>
+              <a:graphicData uri="http://schemas.openxmlformats.org/drawingml/2006/picture">
+                <pic:pic>
+                  <pic:nvPicPr>
+                    <pic:cNvPr id="0" name="01-live-vercel-deployment.png"/>
+                    <pic:cNvPicPr/>
+                  </pic:nvPicPr>
+                  <pic:blipFill>
+                    <a:blip r:embed="rId9"/>
+                    <a:stretch>
+                      <a:fillRect/>
+                    </a:stretch>
+                  </pic:blipFill>
+                  <pic:spPr>
+                    <a:xfrm>
+                      <a:off x="0" y="0"/>
+                      <a:ext cx="5669280" cy="3401568"/>
+                    </a:xfrm>
+                    <a:prstGeom prst="rect"/>
+                  </pic:spPr>
+                </pic:pic>
+              </a:graphicData>
+            </a:graphic>
+          </wp:inline>
+        </w:drawing>
+      </w:r>
+    </w:p>
+    <w:p>
+      <w:pPr>
+        <w:spacing w:before="0" w:after="160"/>
+        <w:jc w:val="center"/>
+      </w:pPr>
+      <w:r>
+        <w:rPr>
+          <w:i/>
+          <w:color w:val="6B7280"/>
+          <w:sz w:val="17"/>
+        </w:rPr>
+        <w:t>Figure 1: OpsPulse deployed live on Vercel production.</w:t>
       </w:r>
     </w:p>
     <w:p>
@@ -172,33 +230,115 @@
     </w:p>
     <w:p>
       <w:r>
-        <w:t>Before initializing files, I configured my Git identity and local/remote repository parameters:</w:t>
+        <w:t>Before initializing files, I configured my Git identity and local/remote repository parameters (user.name, user.email, init.defaultBranch main, core.autocrlf true, histogram diff algorithm, and rerere conflict resolution cache).</w:t>
       </w:r>
     </w:p>
     <w:p>
       <w:pPr>
-        <w:spacing w:before="80" w:after="120"/>
-        <w:ind w:left="288"/>
+        <w:spacing w:before="120" w:after="40"/>
+        <w:jc w:val="center"/>
+      </w:pPr>
+      <w:r>
+        <w:drawing>
+          <wp:inline xmlns:a="http://schemas.openxmlformats.org/drawingml/2006/main" xmlns:pic="http://schemas.openxmlformats.org/drawingml/2006/picture">
+            <wp:extent cx="5669280" cy="3401568"/>
+            <wp:docPr id="2" name="Picture 2"/>
+            <wp:cNvGraphicFramePr>
+              <a:graphicFrameLocks noChangeAspect="1"/>
+            </wp:cNvGraphicFramePr>
+            <a:graphic>
+              <a:graphicData uri="http://schemas.openxmlformats.org/drawingml/2006/picture">
+                <pic:pic>
+                  <pic:nvPicPr>
+                    <pic:cNvPr id="0" name="02-git-config-status.png"/>
+                    <pic:cNvPicPr/>
+                  </pic:nvPicPr>
+                  <pic:blipFill>
+                    <a:blip r:embed="rId10"/>
+                    <a:stretch>
+                      <a:fillRect/>
+                    </a:stretch>
+                  </pic:blipFill>
+                  <pic:spPr>
+                    <a:xfrm>
+                      <a:off x="0" y="0"/>
+                      <a:ext cx="5669280" cy="3401568"/>
+                    </a:xfrm>
+                    <a:prstGeom prst="rect"/>
+                  </pic:spPr>
+                </pic:pic>
+              </a:graphicData>
+            </a:graphic>
+          </wp:inline>
+        </w:drawing>
+      </w:r>
+    </w:p>
+    <w:p>
+      <w:pPr>
+        <w:spacing w:before="0" w:after="160"/>
+        <w:jc w:val="center"/>
       </w:pPr>
       <w:r>
         <w:rPr>
-          <w:rFonts w:ascii="Consolas" w:hAnsi="Consolas"/>
-          <w:color w:val="1E293B"/>
-          <w:sz w:val="18"/>
+          <w:i/>
+          <w:color w:val="6B7280"/>
+          <w:sz w:val="17"/>
         </w:rPr>
-        <w:t>git config --global user.name "Achindra2003"</w:t>
-        <w:br/>
-        <w:t>git config --global user.email "achindra2003@gmail.com"</w:t>
-        <w:br/>
-        <w:t>git config --global init.defaultBranch main</w:t>
-        <w:br/>
-        <w:t>git config core.hooksPath .githooks</w:t>
-        <w:br/>
-        <w:t>git config rerere.enabled true</w:t>
-        <w:br/>
-        <w:t>git config diff.algorithm histogram</w:t>
-        <w:br/>
-        <w:t>gh repo create Achindra2003/devops-lab1-opspulse --public --source=. --remote=origin --push</w:t>
+        <w:t>Figure 2: Verified local and global Git configuration via PowerShell.</w:t>
+      </w:r>
+    </w:p>
+    <w:p>
+      <w:pPr>
+        <w:spacing w:before="120" w:after="40"/>
+        <w:jc w:val="center"/>
+      </w:pPr>
+      <w:r>
+        <w:drawing>
+          <wp:inline xmlns:a="http://schemas.openxmlformats.org/drawingml/2006/main" xmlns:pic="http://schemas.openxmlformats.org/drawingml/2006/picture">
+            <wp:extent cx="5669280" cy="3401568"/>
+            <wp:docPr id="3" name="Picture 3"/>
+            <wp:cNvGraphicFramePr>
+              <a:graphicFrameLocks noChangeAspect="1"/>
+            </wp:cNvGraphicFramePr>
+            <a:graphic>
+              <a:graphicData uri="http://schemas.openxmlformats.org/drawingml/2006/picture">
+                <pic:pic>
+                  <pic:nvPicPr>
+                    <pic:cNvPr id="0" name="03-github-repo-overview.png"/>
+                    <pic:cNvPicPr/>
+                  </pic:nvPicPr>
+                  <pic:blipFill>
+                    <a:blip r:embed="rId11"/>
+                    <a:stretch>
+                      <a:fillRect/>
+                    </a:stretch>
+                  </pic:blipFill>
+                  <pic:spPr>
+                    <a:xfrm>
+                      <a:off x="0" y="0"/>
+                      <a:ext cx="5669280" cy="3401568"/>
+                    </a:xfrm>
+                    <a:prstGeom prst="rect"/>
+                  </pic:spPr>
+                </pic:pic>
+              </a:graphicData>
+            </a:graphic>
+          </wp:inline>
+        </w:drawing>
+      </w:r>
+    </w:p>
+    <w:p>
+      <w:pPr>
+        <w:spacing w:before="0" w:after="160"/>
+        <w:jc w:val="center"/>
+      </w:pPr>
+      <w:r>
+        <w:rPr>
+          <w:i/>
+          <w:color w:val="6B7280"/>
+          <w:sz w:val="17"/>
+        </w:rPr>
+        <w:t>Figure 3: GitHub repository overview with main and develop branches.</w:t>
       </w:r>
     </w:p>
     <w:p>
@@ -219,32 +359,6 @@
     <w:p>
       <w:r>
         <w:t>I adopted the GitFlow branching strategy to ensure a pristine production release while supporting isolated feature development. Direct commits to main and develop were prohibited once initialized.</w:t>
-      </w:r>
-    </w:p>
-    <w:p>
-      <w:pPr>
-        <w:keepNext/>
-        <w:spacing w:before="160" w:after="60"/>
-      </w:pPr>
-      <w:r>
-        <w:rPr>
-          <w:rFonts w:ascii="Arial" w:hAnsi="Arial"/>
-          <w:b/>
-          <w:color w:val="374151"/>
-          <w:sz w:val="22"/>
-        </w:rPr>
-        <w:t>Branch Topology:</w:t>
-      </w:r>
-    </w:p>
-    <w:p>
-      <w:r>
-        <w:t>• main: The production branch. Always stable, deployable, and tagged with semantic versions (v1.0.0, v1.1.0).</w:t>
-        <w:br/>
-        <w:t>• develop: The integration branch where all completed features meet and run through automated CI.</w:t>
-        <w:br/>
-        <w:t>• feature/*: Isolated branches for distinct functionality (feature/telemetry-metrics, feature/alert-banner, feature/incident-logger).</w:t>
-        <w:br/>
-        <w:t>• hotfix/*: Emergency patches branching directly off main (hotfix/latency-threshold).</w:t>
       </w:r>
     </w:p>
     <w:p>
@@ -360,7 +474,7 @@
           <w:p>
             <w:r>
               <w:rPr>
-                <w:sz w:val="18"/>
+                <w:sz w:val="17"/>
               </w:rPr>
               <w:t>PR #1</w:t>
             </w:r>
@@ -373,7 +487,7 @@
           <w:p>
             <w:r>
               <w:rPr>
-                <w:sz w:val="18"/>
+                <w:sz w:val="17"/>
               </w:rPr>
               <w:t>feature/telemetry-metrics</w:t>
             </w:r>
@@ -386,7 +500,7 @@
           <w:p>
             <w:r>
               <w:rPr>
-                <w:sz w:val="18"/>
+                <w:sz w:val="17"/>
               </w:rPr>
               <w:t>develop</w:t>
             </w:r>
@@ -399,7 +513,7 @@
           <w:p>
             <w:r>
               <w:rPr>
-                <w:sz w:val="18"/>
+                <w:sz w:val="17"/>
               </w:rPr>
               <w:t>feat(telemetry): throughput metric card &amp; jitter</w:t>
             </w:r>
@@ -412,7 +526,7 @@
           <w:p>
             <w:r>
               <w:rPr>
-                <w:sz w:val="18"/>
+                <w:sz w:val="17"/>
               </w:rPr>
               <w:t>Non-FF (--no-ff)</w:t>
             </w:r>
@@ -427,7 +541,7 @@
           <w:p>
             <w:r>
               <w:rPr>
-                <w:sz w:val="18"/>
+                <w:sz w:val="17"/>
               </w:rPr>
               <w:t>PR #2</w:t>
             </w:r>
@@ -440,7 +554,7 @@
           <w:p>
             <w:r>
               <w:rPr>
-                <w:sz w:val="18"/>
+                <w:sz w:val="17"/>
               </w:rPr>
               <w:t>feature/alert-banner</w:t>
             </w:r>
@@ -453,7 +567,7 @@
           <w:p>
             <w:r>
               <w:rPr>
-                <w:sz w:val="18"/>
+                <w:sz w:val="17"/>
               </w:rPr>
               <w:t>develop</w:t>
             </w:r>
@@ -466,7 +580,7 @@
           <w:p>
             <w:r>
               <w:rPr>
-                <w:sz w:val="18"/>
+                <w:sz w:val="17"/>
               </w:rPr>
               <w:t>feat(ui): critical gateway latency alert banner</w:t>
             </w:r>
@@ -479,7 +593,7 @@
           <w:p>
             <w:r>
               <w:rPr>
-                <w:sz w:val="18"/>
+                <w:sz w:val="17"/>
               </w:rPr>
               <w:t>Non-FF (--no-ff)</w:t>
             </w:r>
@@ -494,7 +608,7 @@
           <w:p>
             <w:r>
               <w:rPr>
-                <w:sz w:val="18"/>
+                <w:sz w:val="17"/>
               </w:rPr>
               <w:t>PR #3</w:t>
             </w:r>
@@ -507,7 +621,7 @@
           <w:p>
             <w:r>
               <w:rPr>
-                <w:sz w:val="18"/>
+                <w:sz w:val="17"/>
               </w:rPr>
               <w:t>feature/incident-logger</w:t>
             </w:r>
@@ -520,7 +634,7 @@
           <w:p>
             <w:r>
               <w:rPr>
-                <w:sz w:val="18"/>
+                <w:sz w:val="17"/>
               </w:rPr>
               <w:t>develop</w:t>
             </w:r>
@@ -533,7 +647,7 @@
           <w:p>
             <w:r>
               <w:rPr>
-                <w:sz w:val="18"/>
+                <w:sz w:val="17"/>
               </w:rPr>
               <w:t>feat(audit): maintenance notice &amp; incident trail</w:t>
             </w:r>
@@ -546,7 +660,7 @@
           <w:p>
             <w:r>
               <w:rPr>
-                <w:sz w:val="18"/>
+                <w:sz w:val="17"/>
               </w:rPr>
               <w:t>Non-FF (Resolved)</w:t>
             </w:r>
@@ -561,7 +675,7 @@
           <w:p>
             <w:r>
               <w:rPr>
-                <w:sz w:val="18"/>
+                <w:sz w:val="17"/>
               </w:rPr>
               <w:t>PR #4</w:t>
             </w:r>
@@ -574,7 +688,7 @@
           <w:p>
             <w:r>
               <w:rPr>
-                <w:sz w:val="18"/>
+                <w:sz w:val="17"/>
               </w:rPr>
               <w:t>develop</w:t>
             </w:r>
@@ -587,7 +701,7 @@
           <w:p>
             <w:r>
               <w:rPr>
-                <w:sz w:val="18"/>
+                <w:sz w:val="17"/>
               </w:rPr>
               <w:t>main</w:t>
             </w:r>
@@ -600,7 +714,7 @@
           <w:p>
             <w:r>
               <w:rPr>
-                <w:sz w:val="18"/>
+                <w:sz w:val="17"/>
               </w:rPr>
               <w:t>chore(release): merge develop for v1.1.0 release</w:t>
             </w:r>
@@ -613,7 +727,7 @@
           <w:p>
             <w:r>
               <w:rPr>
-                <w:sz w:val="18"/>
+                <w:sz w:val="17"/>
               </w:rPr>
               <w:t>Non-FF (v1.1.0)</w:t>
             </w:r>
@@ -628,7 +742,7 @@
           <w:p>
             <w:r>
               <w:rPr>
-                <w:sz w:val="18"/>
+                <w:sz w:val="17"/>
               </w:rPr>
               <w:t>PR #5</w:t>
             </w:r>
@@ -641,7 +755,7 @@
           <w:p>
             <w:r>
               <w:rPr>
-                <w:sz w:val="18"/>
+                <w:sz w:val="17"/>
               </w:rPr>
               <w:t>hotfix/latency-threshold</w:t>
             </w:r>
@@ -654,7 +768,7 @@
           <w:p>
             <w:r>
               <w:rPr>
-                <w:sz w:val="18"/>
+                <w:sz w:val="17"/>
               </w:rPr>
               <w:t>main</w:t>
             </w:r>
@@ -667,7 +781,7 @@
           <w:p>
             <w:r>
               <w:rPr>
-                <w:sz w:val="18"/>
+                <w:sz w:val="17"/>
               </w:rPr>
               <w:t>fix(telemetry): latency average division guard</w:t>
             </w:r>
@@ -680,7 +794,7 @@
           <w:p>
             <w:r>
               <w:rPr>
-                <w:sz w:val="18"/>
+                <w:sz w:val="17"/>
               </w:rPr>
               <w:t>Non-FF (Hotfix)</w:t>
             </w:r>
@@ -695,7 +809,7 @@
           <w:p>
             <w:r>
               <w:rPr>
-                <w:sz w:val="18"/>
+                <w:sz w:val="17"/>
               </w:rPr>
               <w:t>PR #6</w:t>
             </w:r>
@@ -708,7 +822,7 @@
           <w:p>
             <w:r>
               <w:rPr>
-                <w:sz w:val="18"/>
+                <w:sz w:val="17"/>
               </w:rPr>
               <w:t>develop</w:t>
             </w:r>
@@ -721,7 +835,7 @@
           <w:p>
             <w:r>
               <w:rPr>
-                <w:sz w:val="18"/>
+                <w:sz w:val="17"/>
               </w:rPr>
               <w:t>main</w:t>
             </w:r>
@@ -734,7 +848,7 @@
           <w:p>
             <w:r>
               <w:rPr>
-                <w:sz w:val="18"/>
+                <w:sz w:val="17"/>
               </w:rPr>
               <w:t>docs: add lab 1 report and changelog to main</w:t>
             </w:r>
@@ -747,7 +861,74 @@
           <w:p>
             <w:r>
               <w:rPr>
-                <w:sz w:val="18"/>
+                <w:sz w:val="17"/>
+              </w:rPr>
+              <w:t>Non-FF (--no-ff)</w:t>
+            </w:r>
+          </w:p>
+        </w:tc>
+      </w:tr>
+      <w:tr>
+        <w:tc>
+          <w:tcPr>
+            <w:tcW w:type="dxa" w:w="1987"/>
+          </w:tcPr>
+          <w:p>
+            <w:r>
+              <w:rPr>
+                <w:sz w:val="17"/>
+              </w:rPr>
+              <w:t>PR #7</w:t>
+            </w:r>
+          </w:p>
+        </w:tc>
+        <w:tc>
+          <w:tcPr>
+            <w:tcW w:type="dxa" w:w="1987"/>
+          </w:tcPr>
+          <w:p>
+            <w:r>
+              <w:rPr>
+                <w:sz w:val="17"/>
+              </w:rPr>
+              <w:t>develop</w:t>
+            </w:r>
+          </w:p>
+        </w:tc>
+        <w:tc>
+          <w:tcPr>
+            <w:tcW w:type="dxa" w:w="1987"/>
+          </w:tcPr>
+          <w:p>
+            <w:r>
+              <w:rPr>
+                <w:sz w:val="17"/>
+              </w:rPr>
+              <w:t>main</w:t>
+            </w:r>
+          </w:p>
+        </w:tc>
+        <w:tc>
+          <w:tcPr>
+            <w:tcW w:type="dxa" w:w="1987"/>
+          </w:tcPr>
+          <w:p>
+            <w:r>
+              <w:rPr>
+                <w:sz w:val="17"/>
+              </w:rPr>
+              <w:t>docs: update lab 1 deliverables for individual submission</w:t>
+            </w:r>
+          </w:p>
+        </w:tc>
+        <w:tc>
+          <w:tcPr>
+            <w:tcW w:type="dxa" w:w="1987"/>
+          </w:tcPr>
+          <w:p>
+            <w:r>
+              <w:rPr>
+                <w:sz w:val="17"/>
               </w:rPr>
               <w:t>Non-FF (--no-ff)</w:t>
             </w:r>
@@ -757,8 +938,57 @@
     </w:tbl>
     <w:p>
       <w:pPr>
-        <w:spacing w:after="160"/>
+        <w:spacing w:before="120" w:after="40"/>
+        <w:jc w:val="center"/>
       </w:pPr>
+      <w:r>
+        <w:drawing>
+          <wp:inline xmlns:a="http://schemas.openxmlformats.org/drawingml/2006/main" xmlns:pic="http://schemas.openxmlformats.org/drawingml/2006/picture">
+            <wp:extent cx="5669280" cy="3401568"/>
+            <wp:docPr id="4" name="Picture 4"/>
+            <wp:cNvGraphicFramePr>
+              <a:graphicFrameLocks noChangeAspect="1"/>
+            </wp:cNvGraphicFramePr>
+            <a:graphic>
+              <a:graphicData uri="http://schemas.openxmlformats.org/drawingml/2006/picture">
+                <pic:pic>
+                  <pic:nvPicPr>
+                    <pic:cNvPr id="0" name="04-pull-requests-list.png"/>
+                    <pic:cNvPicPr/>
+                  </pic:nvPicPr>
+                  <pic:blipFill>
+                    <a:blip r:embed="rId12"/>
+                    <a:stretch>
+                      <a:fillRect/>
+                    </a:stretch>
+                  </pic:blipFill>
+                  <pic:spPr>
+                    <a:xfrm>
+                      <a:off x="0" y="0"/>
+                      <a:ext cx="5669280" cy="3401568"/>
+                    </a:xfrm>
+                    <a:prstGeom prst="rect"/>
+                  </pic:spPr>
+                </pic:pic>
+              </a:graphicData>
+            </a:graphic>
+          </wp:inline>
+        </w:drawing>
+      </w:r>
+    </w:p>
+    <w:p>
+      <w:pPr>
+        <w:spacing w:before="0" w:after="160"/>
+        <w:jc w:val="center"/>
+      </w:pPr>
+      <w:r>
+        <w:rPr>
+          <w:i/>
+          <w:color w:val="6B7280"/>
+          <w:sz w:val="17"/>
+        </w:rPr>
+        <w:t>Figure 4: Closed Pull Requests list on GitHub showing all 7 merged PRs.</w:t>
+      </w:r>
     </w:p>
     <w:p>
       <w:pPr>
@@ -781,72 +1011,219 @@
       </w:r>
     </w:p>
     <w:p>
+      <w:pPr>
+        <w:spacing w:before="120" w:after="40"/>
+        <w:jc w:val="center"/>
+      </w:pPr>
       <w:r>
-        <w:t>After PR #2 (feature/alert-banner) was merged into develop, I ran git merge develop on feature/incident-logger. Git halted immediately with a collision:</w:t>
+        <w:drawing>
+          <wp:inline xmlns:a="http://schemas.openxmlformats.org/drawingml/2006/main" xmlns:pic="http://schemas.openxmlformats.org/drawingml/2006/picture">
+            <wp:extent cx="5669280" cy="3401568"/>
+            <wp:docPr id="5" name="Picture 5"/>
+            <wp:cNvGraphicFramePr>
+              <a:graphicFrameLocks noChangeAspect="1"/>
+            </wp:cNvGraphicFramePr>
+            <a:graphic>
+              <a:graphicData uri="http://schemas.openxmlformats.org/drawingml/2006/picture">
+                <pic:pic>
+                  <pic:nvPicPr>
+                    <pic:cNvPr id="0" name="05-merge-conflict-collision.png"/>
+                    <pic:cNvPicPr/>
+                  </pic:nvPicPr>
+                  <pic:blipFill>
+                    <a:blip r:embed="rId13"/>
+                    <a:stretch>
+                      <a:fillRect/>
+                    </a:stretch>
+                  </pic:blipFill>
+                  <pic:spPr>
+                    <a:xfrm>
+                      <a:off x="0" y="0"/>
+                      <a:ext cx="5669280" cy="3401568"/>
+                    </a:xfrm>
+                    <a:prstGeom prst="rect"/>
+                  </pic:spPr>
+                </pic:pic>
+              </a:graphicData>
+            </a:graphic>
+          </wp:inline>
+        </w:drawing>
       </w:r>
     </w:p>
     <w:p>
       <w:pPr>
-        <w:spacing w:before="80" w:after="120"/>
-        <w:ind w:left="288"/>
+        <w:spacing w:before="0" w:after="160"/>
+        <w:jc w:val="center"/>
       </w:pPr>
       <w:r>
         <w:rPr>
-          <w:rFonts w:ascii="Consolas" w:hAnsi="Consolas"/>
-          <w:color w:val="1E293B"/>
-          <w:sz w:val="18"/>
+          <w:i/>
+          <w:color w:val="6B7280"/>
+          <w:sz w:val="17"/>
         </w:rPr>
-        <w:t>Auto-merging index.html</w:t>
-        <w:br/>
-        <w:t>CONFLICT (content): Merge conflict in index.html</w:t>
-        <w:br/>
-        <w:t>Automatic merge failed; fix conflicts and then commit the result.</w:t>
-        <w:br/>
-        <w:t>Recorded preimage for 'index.html'</w:t>
-      </w:r>
-    </w:p>
-    <w:p>
-      <w:r>
-        <w:t>Inspecting index.html revealed the conflict markers:</w:t>
+        <w:t>Figure 5: Git collision triggered when merging develop into feature/incident-logger.</w:t>
       </w:r>
     </w:p>
     <w:p>
       <w:pPr>
-        <w:spacing w:before="80" w:after="120"/>
-        <w:ind w:left="288"/>
+        <w:spacing w:before="120" w:after="40"/>
+        <w:jc w:val="center"/>
+      </w:pPr>
+      <w:r>
+        <w:drawing>
+          <wp:inline xmlns:a="http://schemas.openxmlformats.org/drawingml/2006/main" xmlns:pic="http://schemas.openxmlformats.org/drawingml/2006/picture">
+            <wp:extent cx="5669280" cy="3401568"/>
+            <wp:docPr id="6" name="Picture 6"/>
+            <wp:cNvGraphicFramePr>
+              <a:graphicFrameLocks noChangeAspect="1"/>
+            </wp:cNvGraphicFramePr>
+            <a:graphic>
+              <a:graphicData uri="http://schemas.openxmlformats.org/drawingml/2006/picture">
+                <pic:pic>
+                  <pic:nvPicPr>
+                    <pic:cNvPr id="0" name="06-conflict-markers-editor.png"/>
+                    <pic:cNvPicPr/>
+                  </pic:nvPicPr>
+                  <pic:blipFill>
+                    <a:blip r:embed="rId14"/>
+                    <a:stretch>
+                      <a:fillRect/>
+                    </a:stretch>
+                  </pic:blipFill>
+                  <pic:spPr>
+                    <a:xfrm>
+                      <a:off x="0" y="0"/>
+                      <a:ext cx="5669280" cy="3401568"/>
+                    </a:xfrm>
+                    <a:prstGeom prst="rect"/>
+                  </pic:spPr>
+                </pic:pic>
+              </a:graphicData>
+            </a:graphic>
+          </wp:inline>
+        </w:drawing>
+      </w:r>
+    </w:p>
+    <w:p>
+      <w:pPr>
+        <w:spacing w:before="0" w:after="160"/>
+        <w:jc w:val="center"/>
       </w:pPr>
       <w:r>
         <w:rPr>
-          <w:rFonts w:ascii="Consolas" w:hAnsi="Consolas"/>
-          <w:color w:val="1E293B"/>
-          <w:sz w:val="18"/>
+          <w:i/>
+          <w:color w:val="6B7280"/>
+          <w:sz w:val="17"/>
         </w:rPr>
-        <w:t>&lt;&lt;&lt;&lt;&lt;&lt;&lt; HEAD</w:t>
-        <w:br/>
-        <w:t xml:space="preserve">    &lt;div class="alert-banner alert-warning" id="systemAlertBanner"&gt;</w:t>
-        <w:br/>
-        <w:t xml:space="preserve">      &lt;span class="alert-badge"&gt;MAINTENANCE&lt;/span&gt;</w:t>
-        <w:br/>
-        <w:t xml:space="preserve">      &lt;span class="alert-text" id="alertText"&gt;Scheduled database cluster maintenance in progress...&lt;/span&gt;</w:t>
-        <w:br/>
-        <w:t xml:space="preserve">    &lt;/div&gt;</w:t>
-        <w:br/>
-        <w:t>=======</w:t>
-        <w:br/>
-        <w:t xml:space="preserve">    &lt;div class="alert-banner alert-danger" id="systemAlertBanner"&gt;</w:t>
-        <w:br/>
-        <w:t xml:space="preserve">      &lt;span class="alert-badge"&gt;CRITICAL ALERT&lt;/span&gt;</w:t>
-        <w:br/>
-        <w:t xml:space="preserve">      &lt;span class="alert-text" id="alertText"&gt;High latency detected on EU-Central Gateway (&gt;350ms)...&lt;/span&gt;</w:t>
-        <w:br/>
-        <w:t xml:space="preserve">    &lt;/div&gt;</w:t>
-        <w:br/>
-        <w:t>&gt;&gt;&gt;&gt;&gt;&gt;&gt; develop</w:t>
+        <w:t>Figure 6: Conflicting lines in index.html with &lt;&lt;&lt;&lt;&lt;&lt;&lt; HEAD, =======, and &gt;&gt;&gt;&gt;&gt;&gt;&gt; develop.</w:t>
       </w:r>
     </w:p>
     <w:p>
+      <w:pPr>
+        <w:spacing w:before="120" w:after="40"/>
+        <w:jc w:val="center"/>
+      </w:pPr>
       <w:r>
-        <w:t>I first tested my pre-commit hook by trying to commit with markers intact; the hook blocked it immediately. I then synthesized both notices into a unified adaptive alert banner, stripped the conflict delimiters, and committed: fix(conflict): resolve merge conflict between maintenance notice and failover alert.</w:t>
+        <w:drawing>
+          <wp:inline xmlns:a="http://schemas.openxmlformats.org/drawingml/2006/main" xmlns:pic="http://schemas.openxmlformats.org/drawingml/2006/picture">
+            <wp:extent cx="5669280" cy="3401568"/>
+            <wp:docPr id="7" name="Picture 7"/>
+            <wp:cNvGraphicFramePr>
+              <a:graphicFrameLocks noChangeAspect="1"/>
+            </wp:cNvGraphicFramePr>
+            <a:graphic>
+              <a:graphicData uri="http://schemas.openxmlformats.org/drawingml/2006/picture">
+                <pic:pic>
+                  <pic:nvPicPr>
+                    <pic:cNvPr id="0" name="07-precommit-hook-blocker.png"/>
+                    <pic:cNvPicPr/>
+                  </pic:nvPicPr>
+                  <pic:blipFill>
+                    <a:blip r:embed="rId15"/>
+                    <a:stretch>
+                      <a:fillRect/>
+                    </a:stretch>
+                  </pic:blipFill>
+                  <pic:spPr>
+                    <a:xfrm>
+                      <a:off x="0" y="0"/>
+                      <a:ext cx="5669280" cy="3401568"/>
+                    </a:xfrm>
+                    <a:prstGeom prst="rect"/>
+                  </pic:spPr>
+                </pic:pic>
+              </a:graphicData>
+            </a:graphic>
+          </wp:inline>
+        </w:drawing>
+      </w:r>
+    </w:p>
+    <w:p>
+      <w:pPr>
+        <w:spacing w:before="0" w:after="160"/>
+        <w:jc w:val="center"/>
+      </w:pPr>
+      <w:r>
+        <w:rPr>
+          <w:i/>
+          <w:color w:val="6B7280"/>
+          <w:sz w:val="17"/>
+        </w:rPr>
+        <w:t>Figure 7: Pre-commit hook blocking an accidental commit containing raw conflict markers.</w:t>
+      </w:r>
+    </w:p>
+    <w:p>
+      <w:pPr>
+        <w:spacing w:before="120" w:after="40"/>
+        <w:jc w:val="center"/>
+      </w:pPr>
+      <w:r>
+        <w:drawing>
+          <wp:inline xmlns:a="http://schemas.openxmlformats.org/drawingml/2006/main" xmlns:pic="http://schemas.openxmlformats.org/drawingml/2006/picture">
+            <wp:extent cx="5669280" cy="3401568"/>
+            <wp:docPr id="8" name="Picture 8"/>
+            <wp:cNvGraphicFramePr>
+              <a:graphicFrameLocks noChangeAspect="1"/>
+            </wp:cNvGraphicFramePr>
+            <a:graphic>
+              <a:graphicData uri="http://schemas.openxmlformats.org/drawingml/2006/picture">
+                <pic:pic>
+                  <pic:nvPicPr>
+                    <pic:cNvPr id="0" name="08-conflict-resolved-merged-pr.png"/>
+                    <pic:cNvPicPr/>
+                  </pic:nvPicPr>
+                  <pic:blipFill>
+                    <a:blip r:embed="rId16"/>
+                    <a:stretch>
+                      <a:fillRect/>
+                    </a:stretch>
+                  </pic:blipFill>
+                  <pic:spPr>
+                    <a:xfrm>
+                      <a:off x="0" y="0"/>
+                      <a:ext cx="5669280" cy="3401568"/>
+                    </a:xfrm>
+                    <a:prstGeom prst="rect"/>
+                  </pic:spPr>
+                </pic:pic>
+              </a:graphicData>
+            </a:graphic>
+          </wp:inline>
+        </w:drawing>
+      </w:r>
+    </w:p>
+    <w:p>
+      <w:pPr>
+        <w:spacing w:before="0" w:after="160"/>
+        <w:jc w:val="center"/>
+      </w:pPr>
+      <w:r>
+        <w:rPr>
+          <w:i/>
+          <w:color w:val="6B7280"/>
+          <w:sz w:val="17"/>
+        </w:rPr>
+        <w:t>Figure 8: Clean resolved code and PR #3 successfully merged on GitHub.</w:t>
       </w:r>
     </w:p>
     <w:p>
@@ -905,6 +1282,114 @@
     </w:p>
     <w:p>
       <w:pPr>
+        <w:spacing w:before="120" w:after="40"/>
+        <w:jc w:val="center"/>
+      </w:pPr>
+      <w:r>
+        <w:drawing>
+          <wp:inline xmlns:a="http://schemas.openxmlformats.org/drawingml/2006/main" xmlns:pic="http://schemas.openxmlformats.org/drawingml/2006/picture">
+            <wp:extent cx="5669280" cy="3401568"/>
+            <wp:docPr id="9" name="Picture 9"/>
+            <wp:cNvGraphicFramePr>
+              <a:graphicFrameLocks noChangeAspect="1"/>
+            </wp:cNvGraphicFramePr>
+            <a:graphic>
+              <a:graphicData uri="http://schemas.openxmlformats.org/drawingml/2006/picture">
+                <pic:pic>
+                  <pic:nvPicPr>
+                    <pic:cNvPr id="0" name="09-github-actions-ci-pipeline.png"/>
+                    <pic:cNvPicPr/>
+                  </pic:nvPicPr>
+                  <pic:blipFill>
+                    <a:blip r:embed="rId17"/>
+                    <a:stretch>
+                      <a:fillRect/>
+                    </a:stretch>
+                  </pic:blipFill>
+                  <pic:spPr>
+                    <a:xfrm>
+                      <a:off x="0" y="0"/>
+                      <a:ext cx="5669280" cy="3401568"/>
+                    </a:xfrm>
+                    <a:prstGeom prst="rect"/>
+                  </pic:spPr>
+                </pic:pic>
+              </a:graphicData>
+            </a:graphic>
+          </wp:inline>
+        </w:drawing>
+      </w:r>
+    </w:p>
+    <w:p>
+      <w:pPr>
+        <w:spacing w:before="0" w:after="160"/>
+        <w:jc w:val="center"/>
+      </w:pPr>
+      <w:r>
+        <w:rPr>
+          <w:i/>
+          <w:color w:val="6B7280"/>
+          <w:sz w:val="17"/>
+        </w:rPr>
+        <w:t>Figure 9: GitHub Actions automated CI runs showing green passes across all checks.</w:t>
+      </w:r>
+    </w:p>
+    <w:p>
+      <w:pPr>
+        <w:spacing w:before="120" w:after="40"/>
+        <w:jc w:val="center"/>
+      </w:pPr>
+      <w:r>
+        <w:drawing>
+          <wp:inline xmlns:a="http://schemas.openxmlformats.org/drawingml/2006/main" xmlns:pic="http://schemas.openxmlformats.org/drawingml/2006/picture">
+            <wp:extent cx="5669280" cy="3401568"/>
+            <wp:docPr id="10" name="Picture 10"/>
+            <wp:cNvGraphicFramePr>
+              <a:graphicFrameLocks noChangeAspect="1"/>
+            </wp:cNvGraphicFramePr>
+            <a:graphic>
+              <a:graphicData uri="http://schemas.openxmlformats.org/drawingml/2006/picture">
+                <pic:pic>
+                  <pic:nvPicPr>
+                    <pic:cNvPr id="0" name="10-git-graph-topology.png"/>
+                    <pic:cNvPicPr/>
+                  </pic:nvPicPr>
+                  <pic:blipFill>
+                    <a:blip r:embed="rId18"/>
+                    <a:stretch>
+                      <a:fillRect/>
+                    </a:stretch>
+                  </pic:blipFill>
+                  <pic:spPr>
+                    <a:xfrm>
+                      <a:off x="0" y="0"/>
+                      <a:ext cx="5669280" cy="3401568"/>
+                    </a:xfrm>
+                    <a:prstGeom prst="rect"/>
+                  </pic:spPr>
+                </pic:pic>
+              </a:graphicData>
+            </a:graphic>
+          </wp:inline>
+        </w:drawing>
+      </w:r>
+    </w:p>
+    <w:p>
+      <w:pPr>
+        <w:spacing w:before="0" w:after="160"/>
+        <w:jc w:val="center"/>
+      </w:pPr>
+      <w:r>
+        <w:rPr>
+          <w:i/>
+          <w:color w:val="6B7280"/>
+          <w:sz w:val="17"/>
+        </w:rPr>
+        <w:t>Figure 10: Terminal output of git log --graph --oneline verifying the GitFlow graph.</w:t>
+      </w:r>
+    </w:p>
+    <w:p>
+      <w:pPr>
         <w:keepNext/>
         <w:spacing w:before="280" w:after="80"/>
       </w:pPr>
@@ -920,7 +1405,7 @@
     </w:p>
     <w:p>
       <w:r>
-        <w:t>The most significant takeaway from this lab was the transition from human agreement to mechanical enforcement. In individual and team workflows alike, rules like "don't push to main" depend on memory. Implementing branch protection, commit hooks, and automated CI tests moves those conventions into the repository tooling itself, guaranteeing stability.</w:t>
+        <w:t>The most significant takeaway from this lab was the transition from human agreement to mechanical enforcement. In individual and team workflows alike, rules like "don't push to main" depend on memory. Implementing branch protection, commit hooks, automated CI tests, and cloud continuous deployment (Vercel) moves those conventions into the repository tooling itself, guaranteeing stability.</w:t>
       </w:r>
     </w:p>
     <w:sectPr>

</xml_diff>